<commit_message>
Actividad unica del Corte 2 en ARQ: 12 preguntas para las Clases 6-10
Co-Authored-By: Claude Opus 5 <noreply@anthropic.com>
</commit_message>
<xml_diff>
--- a/Arquitectura de Sistemas Computacionales/Clases/Clase 10 - Costos y sostenibilidad cloud/Actividad autónoma Clase 10 — Costos CloudLite.docx
+++ b/Arquitectura de Sistemas Computacionales/Clases/Clase 10 - Costos y sostenibilidad cloud/Actividad autónoma Clase 10 — Costos CloudLite.docx
@@ -282,7 +282,7 @@
           <w:color w:val="2B2B2B"/>
           <w:sz w:val="22"/>
         </w:rPr>
-        <w:t>Paso 1: liste los 6 elementos de costo de su diseno tomandolos del C4Deployment de la Clase 7 (edge, API, worker, base de datos, almacen de objetos y minutos de integracion continua), verificando que no aparezca ningun componente que no exista en su diagrama y que ninguno quede sin fila, porque al ser clase autonoma nadie va a completar la tabla por usted.</w:t>
+        <w:t>Paso 1: construya en la pregunta 11 la tabla de costos con una fila por cada componente de su despliegue y las columnas componente, driver, nivel B/M/A y apalancamiento; verifique que cada driver sea una variable contable (horas encendidas, GB de salida, GB almacenados, minutos de CI) y no «el uso».</w:t>
       </w:r>
     </w:p>
     <w:p>
@@ -297,7 +297,7 @@
           <w:color w:val="2B2B2B"/>
           <w:sz w:val="22"/>
         </w:rPr>
-        <w:t>Paso 2: complete la tabla de 5 columnas asignando a cada elemento su driver de costo, el nivel bajo, medio o alto, un apalancamiento y el riesgo de aplicarlo, verificando que ningun driver se repita entre filas y que la palabra caro no aparezca sola como explicacion.</w:t>
+        <w:t>Paso 2: fuerce al menos un Alto y un Bajo con su justificacion. Marcar todo como Medio para no decidir es lo que la pregunta busca descartar, y ese criterio vale cero si todas las filas quedan iguales.</w:t>
       </w:r>
     </w:p>
     <w:p>
@@ -312,7 +312,7 @@
           <w:color w:val="2B2B2B"/>
           <w:sz w:val="22"/>
         </w:rPr>
-        <w:t>Paso 3: escriba en ExamLab el mindmap Mermaid con las 5 ramas de drivers (computo, datos, transferencia, ocioso e integracion continua) y 2 hojas concretas por rama, verificando al renderizar que las 10 hojas mencionen elementos reales de su despliegue y no categorias abstractas.</w:t>
+        <w:t>Paso 3: escriba en la pregunta 12 tres acciones de sostenibilidad, cada una con el artefacto donde se comprueba y como se comprueba; aplique la prueba de que otra persona pueda decir en seis meses, mirando el repositorio, si la accion se aplico.</w:t>
       </w:r>
     </w:p>
     <w:p>
@@ -327,22 +327,7 @@
           <w:color w:val="2B2B2B"/>
           <w:sz w:val="22"/>
         </w:rPr>
-        <w:t>Paso 4: desarrolle 3 apalancamientos de ahorro con su estado antes y despues y 3 acciones de sostenibilidad verificables, verificando que cada accion tenga una evidencia que un tercero pueda revisar (tamano de la imagen en megabytes, hora de apagado del lab, numero de replicas en la noche) y que ninguna rompa un requisito del PI.</w:t>
-      </w:r>
-    </w:p>
-    <w:p>
-      <w:pPr>
-        <w:pStyle w:val="ListBullet"/>
-        <w:spacing w:after="40"/>
-      </w:pPr>
-      <w:r>
-        <w:rPr>
-          <w:rFonts w:ascii="Calibri" w:hAnsi="Calibri" w:eastAsia="Calibri"/>
-          <w:b w:val="0"/>
-          <w:color w:val="2B2B2B"/>
-          <w:sz w:val="22"/>
-        </w:rPr>
-        <w:t>Paso 5: integre la tabla, el mindmap y las acciones en la seccion Costos y sostenibilidad del informe (1 pagina) y suba las 5 preguntas a ExamLab (modulo Talleres) antes del domingo 23:59, verificando que no haya inventado ninguna factura en dolares de un proveedor de pago.</w:t>
+        <w:t>Paso 4: ate al menos una de las tres acciones a un driver de costo de la pregunta 11 y suba la actividad completa del Corte 2 a ExamLab antes del domingo 23:59. Es una clase autonoma: no hay encuentro sincrono, y las dudas van por el foro.</w:t>
       </w:r>
     </w:p>
     <w:p>
@@ -522,7 +507,7 @@
           <w:color w:val="2B2B2B"/>
           <w:sz w:val="22"/>
         </w:rPr>
-        <w:t>El estudiante entrega la seccion de costos de CloudLite con 6 elementos del despliegue mapeados a drivers y niveles cualitativos, tres apalancamientos de ahorro con antes y despues, y tres acciones de sostenibilidad verificables.</w:t>
+        <w:t>Las preguntas 11 y 12 de la actividad del Corte 2, que la cierran. Clase autonoma: el estudiante construye la tabla de costos cualitativa de CloudLite y propone tres acciones de sostenibilidad verificables en sus propios artefactos.</w:t>
       </w:r>
     </w:p>
     <w:p>
@@ -537,7 +522,7 @@
           <w:color w:val="2B2B2B"/>
           <w:sz w:val="22"/>
         </w:rPr>
-        <w:t>El taller se resuelve y se entrega en ExamLab (https://uniaj.examlab.workers.dev/), en el modulo Talleres. Son 5 preguntas y suman 100 puntos. Lo que sigue es lo que vas a encontrar en cada una, para que sepas de antemano en que forma se responde:</w:t>
+        <w:t>El taller se resuelve y se entrega en ExamLab (https://uniaj.examlab.workers.dev/), en el modulo Talleres. Son 2 preguntas y suman 24 puntos. Lo que sigue es lo que vas a encontrar en cada una, para que sepas de antemano en que forma se responde:</w:t>
       </w:r>
     </w:p>
     <w:p>
@@ -548,7 +533,7 @@
           <w:color w:val="2B2B2B"/>
           <w:sz w:val="22"/>
         </w:rPr>
-        <w:t>Pregunta 1 - Respuesta escrita (30 pts):</w:t>
+        <w:t>Pregunta 11 - Respuesta escrita (16.25 pts):</w:t>
       </w:r>
       <w:r>
         <w:rPr>
@@ -583,7 +568,7 @@
           <w:color w:val="2B2B2B"/>
           <w:sz w:val="22"/>
         </w:rPr>
-        <w:t>Pregunta 2 - Diagrama (Mermaid) (20 pts):</w:t>
+        <w:t>Pregunta 12 - Respuesta escrita (8.75 pts):</w:t>
       </w:r>
       <w:r>
         <w:rPr>
@@ -592,42 +577,7 @@
           <w:color w:val="2B2B2B"/>
           <w:sz w:val="22"/>
         </w:rPr>
-        <w:t xml:space="preserve"> Mapa de drivers de costo.</w:t>
-      </w:r>
-    </w:p>
-    <w:p>
-      <w:pPr>
-        <w:pStyle w:val="ListBullet"/>
-        <w:spacing w:after="40"/>
-      </w:pPr>
-      <w:r>
-        <w:rPr>
-          <w:rFonts w:ascii="Calibri" w:hAnsi="Calibri" w:eastAsia="Calibri"/>
-          <w:b w:val="0"/>
-          <w:color w:val="2B2B2B"/>
-          <w:sz w:val="22"/>
-        </w:rPr>
-        <w:t>El diagrama se escribe como texto en sintaxis Mermaid y la plataforma lo dibuja al instante: no se sube una imagen. Puedes disenarlo primero a mano en Excalidraw o draw.io y pedirle a una IA que lo traduzca a Mermaid (ver «Del boceto al codigo Mermaid» mas abajo).</w:t>
-      </w:r>
-    </w:p>
-    <w:p>
-      <w:r>
-        <w:rPr>
-          <w:rFonts w:ascii="Calibri" w:hAnsi="Calibri" w:eastAsia="Calibri"/>
-          <w:b/>
-          <w:color w:val="2B2B2B"/>
-          <w:sz w:val="22"/>
-        </w:rPr>
-        <w:t>Pregunta 3 - Respuesta escrita (20 pts):</w:t>
-      </w:r>
-      <w:r>
-        <w:rPr>
-          <w:rFonts w:ascii="Calibri" w:hAnsi="Calibri" w:eastAsia="Calibri"/>
-          <w:b w:val="0"/>
-          <w:color w:val="2B2B2B"/>
-          <w:sz w:val="22"/>
-        </w:rPr>
-        <w:t xml:space="preserve"> Tres apalancamientos de ahorro.</w:t>
+        <w:t xml:space="preserve"> Tres acciones de sostenibilidad tecnica.</w:t>
       </w:r>
     </w:p>
     <w:p>
@@ -643,201 +593,6 @@
           <w:sz w:val="22"/>
         </w:rPr>
         <w:t>Un cuadro de texto. Se escribe directamente en la plataforma; no se sube archivo.</w:t>
-      </w:r>
-    </w:p>
-    <w:p>
-      <w:r>
-        <w:rPr>
-          <w:rFonts w:ascii="Calibri" w:hAnsi="Calibri" w:eastAsia="Calibri"/>
-          <w:b/>
-          <w:color w:val="2B2B2B"/>
-          <w:sz w:val="22"/>
-        </w:rPr>
-        <w:t>Pregunta 4 - Respuesta escrita (20 pts):</w:t>
-      </w:r>
-      <w:r>
-        <w:rPr>
-          <w:rFonts w:ascii="Calibri" w:hAnsi="Calibri" w:eastAsia="Calibri"/>
-          <w:b w:val="0"/>
-          <w:color w:val="2B2B2B"/>
-          <w:sz w:val="22"/>
-        </w:rPr>
-        <w:t xml:space="preserve"> Tres acciones de sostenibilidad.</w:t>
-      </w:r>
-    </w:p>
-    <w:p>
-      <w:pPr>
-        <w:pStyle w:val="ListBullet"/>
-        <w:spacing w:after="40"/>
-      </w:pPr>
-      <w:r>
-        <w:rPr>
-          <w:rFonts w:ascii="Calibri" w:hAnsi="Calibri" w:eastAsia="Calibri"/>
-          <w:b w:val="0"/>
-          <w:color w:val="2B2B2B"/>
-          <w:sz w:val="22"/>
-        </w:rPr>
-        <w:t>Un cuadro de texto. Se escribe directamente en la plataforma; no se sube archivo.</w:t>
-      </w:r>
-    </w:p>
-    <w:p>
-      <w:r>
-        <w:rPr>
-          <w:rFonts w:ascii="Calibri" w:hAnsi="Calibri" w:eastAsia="Calibri"/>
-          <w:b/>
-          <w:color w:val="2B2B2B"/>
-          <w:sz w:val="22"/>
-        </w:rPr>
-        <w:t>Pregunta 5 - Seleccion multiple (10 pts):</w:t>
-      </w:r>
-      <w:r>
-        <w:rPr>
-          <w:rFonts w:ascii="Calibri" w:hAnsi="Calibri" w:eastAsia="Calibri"/>
-          <w:b w:val="0"/>
-          <w:color w:val="2B2B2B"/>
-          <w:sz w:val="22"/>
-        </w:rPr>
-        <w:t xml:space="preserve"> Costos en la nube: que es cierto.</w:t>
-      </w:r>
-    </w:p>
-    <w:p>
-      <w:pPr>
-        <w:pStyle w:val="ListBullet"/>
-        <w:spacing w:after="40"/>
-      </w:pPr>
-      <w:r>
-        <w:rPr>
-          <w:rFonts w:ascii="Calibri" w:hAnsi="Calibri" w:eastAsia="Calibri"/>
-          <w:b w:val="0"/>
-          <w:color w:val="2B2B2B"/>
-          <w:sz w:val="22"/>
-        </w:rPr>
-        <w:t>Varias opciones y mas de una correcta; marque todas las que apliquen.</w:t>
-      </w:r>
-    </w:p>
-    <w:p>
-      <w:pPr>
-        <w:spacing w:after="120" w:before="0"/>
-        <w:jc w:val="left"/>
-      </w:pPr>
-      <w:r>
-        <w:rPr>
-          <w:rFonts w:ascii="Calibri" w:hAnsi="Calibri" w:eastAsia="Calibri"/>
-          <w:b/>
-          <w:color w:val="095292"/>
-          <w:sz w:val="22"/>
-        </w:rPr>
-        <w:t>Del boceto al codigo Mermaid</w:t>
-      </w:r>
-    </w:p>
-    <w:p>
-      <w:pPr>
-        <w:spacing w:after="120" w:before="0"/>
-        <w:jc w:val="left"/>
-      </w:pPr>
-      <w:r>
-        <w:rPr>
-          <w:rFonts w:ascii="Calibri" w:hAnsi="Calibri" w:eastAsia="Calibri"/>
-          <w:b w:val="0"/>
-          <w:color w:val="2B2B2B"/>
-          <w:sz w:val="22"/>
-        </w:rPr>
-        <w:t>La pregunta de diagrama NO recibe imagenes: se responde con codigo Mermaid (`mindmap`) que la plataforma dibuja al instante. No tienes que escribirlo de memoria; el camino corto es este:</w:t>
-      </w:r>
-    </w:p>
-    <w:p>
-      <w:r>
-        <w:rPr>
-          <w:rFonts w:ascii="Calibri" w:hAnsi="Calibri" w:eastAsia="Calibri"/>
-          <w:b/>
-          <w:color w:val="2B2B2B"/>
-          <w:sz w:val="22"/>
-        </w:rPr>
-        <w:t>1. Disena visual:</w:t>
-      </w:r>
-      <w:r>
-        <w:rPr>
-          <w:rFonts w:ascii="Calibri" w:hAnsi="Calibri" w:eastAsia="Calibri"/>
-          <w:b w:val="0"/>
-          <w:color w:val="2B2B2B"/>
-          <w:sz w:val="22"/>
-        </w:rPr>
-        <w:t xml:space="preserve"> Dibuja el diagrama como quieras en Excalidraw o draw.io: es mas rapido arrastrar cajas que escribir codigo, y ahi es donde piensas el modelo.</w:t>
-      </w:r>
-    </w:p>
-    <w:p>
-      <w:r>
-        <w:rPr>
-          <w:rFonts w:ascii="Calibri" w:hAnsi="Calibri" w:eastAsia="Calibri"/>
-          <w:b/>
-          <w:color w:val="2B2B2B"/>
-          <w:sz w:val="22"/>
-        </w:rPr>
-        <w:t>2. Traduce con IA:</w:t>
-      </w:r>
-      <w:r>
-        <w:rPr>
-          <w:rFonts w:ascii="Calibri" w:hAnsi="Calibri" w:eastAsia="Calibri"/>
-          <w:b w:val="0"/>
-          <w:color w:val="2B2B2B"/>
-          <w:sz w:val="22"/>
-        </w:rPr>
-        <w:t xml:space="preserve"> Copia o describe tu boceto a una IA y pidele el codigo Mermaid: «convierte este diagrama a Mermaid usando `mindmap`». Revisa el resultado: la IA acierta la sintaxis, no tu modelo.</w:t>
-      </w:r>
-    </w:p>
-    <w:p>
-      <w:r>
-        <w:rPr>
-          <w:rFonts w:ascii="Calibri" w:hAnsi="Calibri" w:eastAsia="Calibri"/>
-          <w:b/>
-          <w:color w:val="2B2B2B"/>
-          <w:sz w:val="22"/>
-        </w:rPr>
-        <w:t>3. Pega y renderiza en ExamLab:</w:t>
-      </w:r>
-      <w:r>
-        <w:rPr>
-          <w:rFonts w:ascii="Calibri" w:hAnsi="Calibri" w:eastAsia="Calibri"/>
-          <w:b w:val="0"/>
-          <w:color w:val="2B2B2B"/>
-          <w:sz w:val="22"/>
-        </w:rPr>
-        <w:t xml:space="preserve"> Pega ese codigo en la caja de texto de la pregunta y mira como lo dibuja la plataforma. Si no renderiza, corrige ahi mismo: lo que se califica es el diagrama renderizado dentro de ExamLab.</w:t>
-      </w:r>
-    </w:p>
-    <w:p>
-      <w:r>
-        <w:rPr>
-          <w:rFonts w:ascii="Calibri" w:hAnsi="Calibri" w:eastAsia="Calibri"/>
-          <w:b/>
-          <w:color w:val="2B2B2B"/>
-          <w:sz w:val="22"/>
-        </w:rPr>
-        <w:t>4. Guarda el PNG para tu PI:</w:t>
-      </w:r>
-      <w:r>
-        <w:rPr>
-          <w:rFonts w:ascii="Calibri" w:hAnsi="Calibri" w:eastAsia="Calibri"/>
-          <w:b w:val="0"/>
-          <w:color w:val="2B2B2B"/>
-          <w:sz w:val="22"/>
-        </w:rPr>
-        <w:t xml:space="preserve"> Exporta tambien la imagen a la carpeta de tu Proyecto Integrador. Esa copia es para tu informe; no reemplaza la respuesta en la plataforma.</w:t>
-      </w:r>
-    </w:p>
-    <w:p>
-      <w:pPr>
-        <w:spacing w:after="120" w:before="0"/>
-        <w:jc w:val="left"/>
-      </w:pPr>
-      <w:r>
-        <w:rPr>
-          <w:rFonts w:ascii="Calibri" w:hAnsi="Calibri" w:eastAsia="Calibri"/>
-          <w:b w:val="0"/>
-          <w:color w:val="2B2B2B"/>
-          <w:sz w:val="22"/>
-        </w:rPr>
-        <w:t>Si la IA te devuelve algo que no renderiza, no lo pegues tal cual: corrigelo en ExamLab hasta ver el dibujo. Un diagrama que no renderiza no se puede calificar.</w:t>
       </w:r>
     </w:p>
     <w:p>

</xml_diff>

<commit_message>
BD II y ARQ: clases 3 a 8 al estandar de terminado y justificacion de todas las opciones en los parciales
</commit_message>
<xml_diff>
--- a/Arquitectura de Sistemas Computacionales/Clases/Clase 10 - Costos y sostenibilidad cloud/Actividad autónoma Clase 10 — Costos CloudLite.docx
+++ b/Arquitectura de Sistemas Computacionales/Clases/Clase 10 - Costos y sostenibilidad cloud/Actividad autónoma Clase 10 — Costos CloudLite.docx
@@ -477,7 +477,7 @@
           <w:color w:val="2B2B2B"/>
           <w:sz w:val="22"/>
         </w:rPr>
-        <w:t>Entrega en ExamLab (https://uniaj.examlab.workers.dev/ · módulo Talleres) · domingo 23:59 (regla del Acuerdo). Modalidad de trabajo: individual por defecto; el docente puede autorizar equipos de 2 o 3 y en ese caso el artefacto puede ser compartido, pero el envío en ExamLab es siempre individual (responde con tus propias palabras).</w:t>
+        <w:t>Entrega en ExamLab (https://uniaj.examlab.workers.dev/ · módulo Talleres). Las preguntas de hoy son parte de UNA sola actividad, compartida con las Clases 6, 7 y 8: se guarda el avance de hoy y la actividad se entrega completa el domingo 23:59 de la semana de la Clase 10. No hay entrega este domingo. Modalidad de trabajo: individual por defecto; el docente puede autorizar equipos de 2 o 3 y en ese caso el artefacto puede ser compartido, pero el envío en ExamLab es siempre individual (responde con tus propias palabras).</w:t>
       </w:r>
     </w:p>
     <w:p>
@@ -522,7 +522,7 @@
           <w:color w:val="2B2B2B"/>
           <w:sz w:val="22"/>
         </w:rPr>
-        <w:t>El taller se resuelve y se entrega en ExamLab (https://uniaj.examlab.workers.dev/), en el modulo Talleres. Son 2 preguntas y suman 24 puntos. Lo que sigue es lo que vas a encontrar en cada una, para que sepas de antemano en que forma se responde:</w:t>
+        <w:t>El taller se resuelve y se entrega en ExamLab (https://uniaj.examlab.workers.dev/), en el modulo Talleres. Son 2 preguntas y suman 25 puntos. Lo que sigue es lo que vas a encontrar en cada una, para que sepas de antemano en que forma se responde:</w:t>
       </w:r>
     </w:p>
     <w:p>

</xml_diff>